<commit_message>
Coordinator workflow: document the control-arm UpToDate interface
Stanford's Lane-proxied UpToDate now surfaces "Ask Expert AI" (header,
landing page, and a banner atop search results), gated behind a personal
UpToDate sign-in; conventional results remain traditional. Coordinator now
screenshots the comparator interface at launch, midpoint, and close so the
Methods can state precisely what the control arm contained.

Co-Authored-By: Claude Opus 4.7 <noreply@anthropic.com>
</commit_message>
<xml_diff>
--- a/docs/Coordinator-Workflow.docx
+++ b/docs/Coordinator-Workflow.docx
@@ -178,6 +178,18 @@
       </w:pPr>
       <w:r>
         <w:t xml:space="preserve">Do not edit the case, the tasks, or the assessment items during enrollment, and do not use the content editor. The instrument is fixed by the preregistration. The editing features exist for setup and are off-limits while the study runs.</w:t>
+      </w:r>
+    </w:p>
+    <w:p>
+      <w:pPr>
+        <w:pStyle w:val="Compact"/>
+        <w:numPr>
+          <w:ilvl w:val="0"/>
+          <w:numId w:val="1003"/>
+        </w:numPr>
+      </w:pPr>
+      <w:r>
+        <w:t xml:space="preserve">Document the control-arm resource at study launch, midpoint, and close: sign out of any personal UpToDate account, open UpToDate through the Lane proxy, and screenshot the landing page and one search-results page. File the screenshots with the study records so the comparator interface during the study window is documented, including the presence and gating of any AI features.</w:t>
       </w:r>
     </w:p>
     <w:bookmarkEnd w:id="11"/>

</xml_diff>